<commit_message>
chore: regenerate exports after MSA heading translation
scripts/build-exports.mjs output reflects the Ukrainian section
headings in services-agreement-2026.uk — previous commit's `pnpm build`
doesn't run build-exports (only build:full does). Running build:exports
manually picks up the new source.

Co-Authored-By: Claude Opus 4.6 <noreply@anthropic.com>
</commit_message>
<xml_diff>
--- a/public/exports/contracts/data-processing-agreement-2026/contract.en.docx
+++ b/public/exports/contracts/data-processing-agreement-2026/contract.en.docx
@@ -78,6 +78,23 @@
       </w:pPr>
       <w:r>
         <w:t xml:space="preserve">Data Processing Agreement</w:t>
+      </w:r>
+    </w:p>
+    <w:p>
+      <w:pPr>
+        <w:pBdr>
+          <w:left w:val="single" w:color="B8C2F5" w:sz="12" w:space="8"/>
+        </w:pBdr>
+        <w:spacing w:after="160" w:before="120"/>
+        <w:ind w:left="400"/>
+      </w:pPr>
+      <w:r>
+        <w:rPr>
+          <w:i/>
+          <w:iCs/>
+          <w:color w:val="555555"/>
+        </w:rPr>
+        <w:t xml:space="preserve">**Negotiation Brief — DPA / GDPR**  **Три ключові точки тертя:** список субпроцесорів, право на аудит, строк повідомлення про порушення даних.  **Типовий вплив на sales-цикл:** кастомні переговори по DPA додають 4-12 тижнів до закриття угоди. Максимально використовуйте стандартизовані формулювання, щоб скоротити цей термін.  **Асиметрія ризиків:** штрафи GDPR (до 4% глобального обороту) перевищують вартість будь-якого контракту. Клієнти завжди намагаються вивести штрафи з-під загального ліміту відповідальності. Це єдина поступка, яку варто давати без опору.  **Позиція підрядника:** ми процесор, не контролер. Наша мета — чітко розмежувати відповідальність і зберегти операційну гнучкість (субпроцесори, строки, локація обробки).  **Стратегія:** починайте з нашого стандартного DPA. Якщо клієнт наполягає на кастомних змінах — переходьте до обговорення конкретних пунктів нижче, а не переписуйте весь документ.</w:t>
       </w:r>
     </w:p>
     <w:p>
@@ -537,6 +554,51 @@
     </w:p>
     <w:p>
       <w:pPr>
+        <w:spacing w:after="180"/>
+        <w:jc w:val="both"/>
+      </w:pPr>
+      <w:r>
+        <w:t xml:space="preserve">&lt;Voice voice="legal"&gt;Таблиця Scope of Processing — це ядро DPA за ст. 28(3) GDPR. Кожне поле має бути заповнене конкретно, а не "as described in MSA". Наглядові органи перевіряють саме цю таблицю першою.&lt;/Voice&gt;</w:t>
+      </w:r>
+    </w:p>
+    <w:p>
+      <w:pPr>
+        <w:spacing w:after="180"/>
+        <w:jc w:val="both"/>
+      </w:pPr>
+      <w:r>
+        <w:t xml:space="preserve">&lt;Voice voice="business"&gt;Не залишайте "As specified in Annex A" без заповненого Annex A при підписанні. Це затримає закриття угоди — клієнтський DPO не підпише документ з порожніми полями.&lt;/Voice&gt;</w:t>
+      </w:r>
+    </w:p>
+    <w:p>
+      <w:pPr>
+        <w:spacing w:after="180"/>
+        <w:jc w:val="both"/>
+      </w:pPr>
+      <w:r>
+        <w:t xml:space="preserve">&lt;Voice voice="negotiations"&gt;Клієнти часто просять вказати конкретні cloud-регіони та заборонити обробку за межами ЄС. Компроміс: вказати "EU (Germany)" як primary location, але зберегти право на субпроцесорів в інших юрисдикціях через Annex B.&lt;/Voice&gt;</w:t>
+      </w:r>
+    </w:p>
+    <w:p>
+      <w:pPr>
+        <w:spacing w:after="180"/>
+        <w:jc w:val="both"/>
+      </w:pPr>
+      <w:r>
+        <w:t xml:space="preserve">&lt;Voice voice="delivery"&gt;Команда розробки має знати, які саме категорії даних обробляються. Якщо в таблиці вказані special categories (здоров'я, біометрія) — це тригер для додаткових технічних заходів та DPIA.&lt;/Voice&gt;</w:t>
+      </w:r>
+    </w:p>
+    <w:p>
+      <w:pPr>
+        <w:spacing w:after="180"/>
+        <w:jc w:val="both"/>
+      </w:pPr>
+      <w:r>
+        <w:t xml:space="preserve">&lt;Voice voice="interaction"&gt;Ця таблиця посилається на Annex A (деталі обробки) та MSA (scope послуг). Будь-яка зміна в MSA scope автоматично впливає на DPA — переконайтесь, що amendment process це враховує.&lt;/Voice&gt;</w:t>
+      </w:r>
+    </w:p>
+    <w:p>
+      <w:pPr>
         <w:pStyle w:val="Heading2"/>
         <w:keepNext/>
         <w:spacing w:after="180" w:before="360"/>
@@ -834,6 +896,51 @@
     </w:p>
     <w:p>
       <w:pPr>
+        <w:spacing w:after="180"/>
+        <w:jc w:val="both"/>
+      </w:pPr>
+      <w:r>
+        <w:t xml:space="preserve">&lt;Voice voice="legal"&gt;Стаття 28(3) GDPR вимагає конкретних зобов'язань процесора: інструкції контролера, конфіденційність, технічні заходи, субпроцесори, допомога контролеру, повернення/видалення даних, аудит. Перевірте, що клауза покриває всі сім пунктів.&lt;/Voice&gt;</w:t>
+      </w:r>
+    </w:p>
+    <w:p>
+      <w:pPr>
+        <w:spacing w:after="180"/>
+        <w:jc w:val="both"/>
+      </w:pPr>
+      <w:r>
+        <w:t xml:space="preserve">&lt;Voice voice="business"&gt;Три найдорожчі зобов'язання з точки зору операційних витрат: (1) повідомлення про порушення — клієнти просять 24 години, ринковий стандарт 48-72 години після підтвердження (не після виявлення); (2) видалення даних — 30 днів стандарт, деякі клієнти хочуть 14 днів; (3) аудити — необмежені аудити = необмежені витрати.&lt;/Voice&gt;</w:t>
+      </w:r>
+    </w:p>
+    <w:p>
+      <w:pPr>
+        <w:spacing w:after="180"/>
+        <w:jc w:val="both"/>
+      </w:pPr>
+      <w:r>
+        <w:t xml:space="preserve">&lt;Voice voice="negotiations"&gt;Субпроцесори — головне поле бою. Клієнти хочуть prior written consent на кожного субпроцесора. Наша позиція: notice-and-objection mechanism з правом на розірвання як єдиний засіб захисту. Аргумент: "ми не можемо зупинити production на тиждень, поки ваш DPO review'ює зміну хостинг-провайдера." Право на аудит: пропонуйте 1 раз на рік з 30-денним попередженням + SOC 2 звіти між аудитами.&lt;/Voice&gt;</w:t>
+      </w:r>
+    </w:p>
+    <w:p>
+      <w:pPr>
+        <w:spacing w:after="180"/>
+        <w:jc w:val="both"/>
+      </w:pPr>
+      <w:r>
+        <w:t xml:space="preserve">&lt;Voice voice="delivery"&gt;Breach notification timeline прив'язаний до момент "awareness" (підтвердження інциденту), а не до моменту виявлення аномалії. Команда DevOps має мати чіткий incident response runbook з визначенням, що вважається "confirmed breach". Строк видалення даних (30 днів) має бути реалістичним для вашої інфраструктури — перевірте backup retention policies.&lt;/Voice&gt;</w:t>
+      </w:r>
+    </w:p>
+    <w:p>
+      <w:pPr>
+        <w:spacing w:after="180"/>
+        <w:jc w:val="both"/>
+      </w:pPr>
+      <w:r>
+        <w:t xml:space="preserve">&lt;Voice voice="interaction"&gt;Цей розділ посилається на Annex B (субпроцесори) та Annex C (технічні заходи). Зобов'язання з повернення/видалення даних кореспондують з Section 6 (Term and Termination). Breach notification може тригернути liability clause в Section 4.&lt;/Voice&gt;</w:t>
+      </w:r>
+    </w:p>
+    <w:p>
+      <w:pPr>
         <w:pStyle w:val="Heading2"/>
         <w:keepNext/>
         <w:spacing w:after="180" w:before="360"/>
@@ -1053,6 +1160,42 @@
     </w:p>
     <w:p>
       <w:pPr>
+        <w:spacing w:after="180"/>
+        <w:jc w:val="both"/>
+      </w:pPr>
+      <w:r>
+        <w:t xml:space="preserve">&lt;Voice voice="legal"&gt;Конфіденційність у DPA — це не просто NDA. Стаття 28(3)(b) GDPR вимагає, щоб усі особи, які мають доступ до персональних даних, були зобов'язані конфіденційністю. Це стосується і субпідрядників, і фрілансерів — не тільки штатних працівників.&lt;/Voice&gt;</w:t>
+      </w:r>
+    </w:p>
+    <w:p>
+      <w:pPr>
+        <w:spacing w:after="180"/>
+        <w:jc w:val="both"/>
+      </w:pPr>
+      <w:r>
+        <w:t xml:space="preserve">&lt;Voice voice="business"&gt;Додатковий параграф про statutory obligation — це стандартне формулювання, яке рідко викликає суперечки. Якщо клієнт наполягає на додаткових зобов'язаннях (наприклад, background checks для персоналу) — це збільшує HR-витрати. Оцініть, чи виправдано це обсягом контракту.&lt;/Voice&gt;</w:t>
+      </w:r>
+    </w:p>
+    <w:p>
+      <w:pPr>
+        <w:spacing w:after="180"/>
+        <w:jc w:val="both"/>
+      </w:pPr>
+      <w:r>
+        <w:t xml:space="preserve">&lt;Voice voice="negotiations"&gt;Цей розділ рідко є точкою тертя. Якщо клієнт хоче більш жорстких формулювань — поступіться тут, щоб мати leverage на субпроцесорах або аудитах. Типова поступка: "committed to confidentiality AND under an appropriate statutory obligation" замість "OR".&lt;/Voice&gt;</w:t>
+      </w:r>
+    </w:p>
+    <w:p>
+      <w:pPr>
+        <w:spacing w:after="180"/>
+        <w:jc w:val="both"/>
+      </w:pPr>
+      <w:r>
+        <w:t xml:space="preserve">&lt;Voice voice="delivery"&gt;Кожен розробник, який має доступ до production даних клієнта, має бути під NDA або employment contract з confidentiality clause. PM має перевірити це перед onboarding нових людей на проект.&lt;/Voice&gt;</w:t>
+      </w:r>
+    </w:p>
+    <w:p>
+      <w:pPr>
         <w:pStyle w:val="Heading2"/>
         <w:keepNext/>
         <w:spacing w:after="180" w:before="360"/>
@@ -1181,6 +1324,51 @@
     </w:p>
     <w:p>
       <w:pPr>
+        <w:spacing w:after="180"/>
+        <w:jc w:val="both"/>
+      </w:pPr>
+      <w:r>
+        <w:t xml:space="preserve">&lt;Voice voice="legal"&gt;Виключення GDPR-штрафів з liability cap — це ринковий стандарт і правильна позиція. Штрафи за ст. 83 GDPR (до 20 млн EUR або 4% обороту) не підлягають contractual indemnification за більшістю юрисдикцій ЄС. Спроба включити їх у cap створює хибне відчуття безпеки.&lt;/Voice&gt;</w:t>
+      </w:r>
+    </w:p>
+    <w:p>
+      <w:pPr>
+        <w:spacing w:after="180"/>
+        <w:jc w:val="both"/>
+      </w:pPr>
+      <w:r>
+        <w:t xml:space="preserve">&lt;Voice voice="business"&gt;Liability cap у DPA — найчастіша причина ескалації до C-level. Клієнти хочуть unlimited liability за data breaches. Наша позиція: загальний cap з MSA застосовується, але GDPR-штрафи excluded. Це розумний компроміс: клієнт захищений від регуляторних ризиків, ми захищені від disproportionate claims.&lt;/Voice&gt;</w:t>
+      </w:r>
+    </w:p>
+    <w:p>
+      <w:pPr>
+        <w:spacing w:after="180"/>
+        <w:jc w:val="both"/>
+      </w:pPr>
+      <w:r>
+        <w:t xml:space="preserve">&lt;Voice voice="negotiations"&gt;Якщо клієнт наполягає на окремому, вищому cap для DPA — запропонуйте 2x annual contract value для data-related claims (окремо від загального cap). Ніколи не погоджуйтесь на unlimited liability. Аргумент: "наш страховий поліс покриває X, unlimited liability зробить проект нерентабельним."&lt;/Voice&gt;</w:t>
+      </w:r>
+    </w:p>
+    <w:p>
+      <w:pPr>
+        <w:spacing w:after="180"/>
+        <w:jc w:val="both"/>
+      </w:pPr>
+      <w:r>
+        <w:t xml:space="preserve">&lt;Voice voice="delivery"&gt;Liability clause безпосередньо впливає на те, яке cyber insurance потрібно мати. Якщо cap підвищений — повідомте фінансовий відділ для перевірки страхового покриття перед підписанням.&lt;/Voice&gt;</w:t>
+      </w:r>
+    </w:p>
+    <w:p>
+      <w:pPr>
+        <w:spacing w:after="180"/>
+        <w:jc w:val="both"/>
+      </w:pPr>
+      <w:r>
+        <w:t xml:space="preserve">&lt;Voice voice="interaction"&gt;Цей розділ кореспондує з liability clause в MSA. Переконайтесь, що DPA cap не суперечить MSA cap. Note про GDPR-штрафи — це carve-out, який має бути зеркально відображений в MSA, якщо MSA підписано раніше.&lt;/Voice&gt;</w:t>
+      </w:r>
+    </w:p>
+    <w:p>
+      <w:pPr>
         <w:pStyle w:val="Heading2"/>
         <w:keepNext/>
         <w:spacing w:after="180" w:before="360"/>
@@ -1258,6 +1446,51 @@
       </w:pPr>
       <w:r>
         <w:t xml:space="preserve">This DPA is effective for the duration of the MSA. Upon termination of the MSA, the data return and deletion obligations in Section 2 above shall apply.</w:t>
+      </w:r>
+    </w:p>
+    <w:p>
+      <w:pPr>
+        <w:spacing w:after="180"/>
+        <w:jc w:val="both"/>
+      </w:pPr>
+      <w:r>
+        <w:t xml:space="preserve">&lt;Voice voice="legal"&gt;Стаття 28(3)(g) GDPR вимагає: після завершення обробки — видалити або повернути всі персональні дані та видалити існуючі копії (якщо законодавство ЄС не вимагає зберігання). Формулювання "shall apply" недостатньо конкретне — клієнт може вимагати explicit timeline.&lt;/Voice&gt;</w:t>
+      </w:r>
+    </w:p>
+    <w:p>
+      <w:pPr>
+        <w:spacing w:after="180"/>
+        <w:jc w:val="both"/>
+      </w:pPr>
+      <w:r>
+        <w:t xml:space="preserve">&lt;Voice voice="business"&gt;Строк видалення даних після termination — часта точка переговорів. 30 днів — ринковий стандарт. Деякі enterprise-клієнти вимагають 14 днів. Враховуйте реальну вартість прискореного видалення: backup rotation cycles, archived logs, third-party sub-processors з власними retention policies.&lt;/Voice&gt;</w:t>
+      </w:r>
+    </w:p>
+    <w:p>
+      <w:pPr>
+        <w:spacing w:after="180"/>
+        <w:jc w:val="both"/>
+      </w:pPr>
+      <w:r>
+        <w:t xml:space="preserve">&lt;Voice voice="negotiations"&gt;Клієнти часто просять: (1) сертифікат про видалення даних; (2) право обрати "return" замість "delete"; (3) конкретний строк (14-30 днів). Давайте сертифікат — це безкоштовно. Return vs delete — наш вибір за замовчуванням "delete unless instructed otherwise." Строк — тримайте 30 днів, аргумент: "backup retention cycles не дозволяють швидше."&lt;/Voice&gt;</w:t>
+      </w:r>
+    </w:p>
+    <w:p>
+      <w:pPr>
+        <w:spacing w:after="180"/>
+        <w:jc w:val="both"/>
+      </w:pPr>
+      <w:r>
+        <w:t xml:space="preserve">&lt;Voice voice="delivery"&gt;Після завершення проекту DevOps має виконати data deletion checklist: production DB, staging, backups, logs, error tracking (Sentry), analytics. Сертифікат видалення підписує CTO або Head of Engineering. Заздалегідь підготуйте шаблон.&lt;/Voice&gt;</w:t>
+      </w:r>
+    </w:p>
+    <w:p>
+      <w:pPr>
+        <w:spacing w:after="180"/>
+        <w:jc w:val="both"/>
+      </w:pPr>
+      <w:r>
+        <w:t xml:space="preserve">&lt;Voice voice="interaction"&gt;Строки видалення мають бути узгоджені із зобов'язаннями в Section 2 (Processor Obligations). Якщо MSA має окремий survival clause — перевірте, що він не конфліктує з deletion obligations. Annex B (субпроцесори) — кожен субпроцесор також має видалити дані.&lt;/Voice&gt;</w:t>
       </w:r>
     </w:p>
     <w:p>
@@ -1565,6 +1798,42 @@
         <w:t xml:space="preserve">Annex A — Details of Processing</w:t>
       </w:r>
     </w:p>
+    <w:p>
+      <w:pPr>
+        <w:spacing w:after="180"/>
+        <w:jc w:val="both"/>
+      </w:pPr>
+      <w:r>
+        <w:t xml:space="preserve">&lt;Voice voice="legal"&gt;Annex A — обов'язковий елемент за ст. 28(3) GDPR. Наглядові органи перевіряють конкретність заповнення. "Various data" або "as needed" — не проходить. Кожне поле має бути специфічним для проекту.&lt;/Voice&gt;</w:t>
+      </w:r>
+    </w:p>
+    <w:p>
+      <w:pPr>
+        <w:spacing w:after="180"/>
+        <w:jc w:val="both"/>
+      </w:pPr>
+      <w:r>
+        <w:t xml:space="preserve">&lt;Voice voice="business"&gt;Клієнтський DPO зазвичай pushback'ить на: (1) занадто широкі categories of data subjects — звужуйте до реальних; (2) special categories — якщо проект не потребує health/biometric data, явно вкажіть "None"; (3) location of processing — клієнти все частіше вимагають EU-only processing.&lt;/Voice&gt;</w:t>
+      </w:r>
+    </w:p>
+    <w:p>
+      <w:pPr>
+        <w:spacing w:after="180"/>
+        <w:jc w:val="both"/>
+      </w:pPr>
+      <w:r>
+        <w:t xml:space="preserve">&lt;Voice voice="negotiations"&gt;Location of processing — зростаючий тренд: клієнти вимагають гарантії, що дані не покидають ЄС. Якщо ваша команда в Україні — це не ЄС. Рішення: дані зберігаються в EU cloud (Frankfurt/Ireland), доступ з України через encrypted channels. Вкажіть це явно. Якщо клієнт наполягає на EU-only access — це потребує VDI/jump-server інфраструктури та збільшує вартість.&lt;/Voice&gt;</w:t>
+      </w:r>
+    </w:p>
+    <w:p>
+      <w:pPr>
+        <w:spacing w:after="180"/>
+        <w:jc w:val="both"/>
+      </w:pPr>
+      <w:r>
+        <w:t xml:space="preserve">&lt;Voice voice="delivery"&gt;Заповнюйте Annex A разом із tech lead проекту. Categories of data та processing operations мають точно відповідати тому, що реально відбувається в коді. Якщо scope зміниться — Annex A потребує amendment.&lt;/Voice&gt;</w:t>
+      </w:r>
+    </w:p>
     <w:tbl>
       <w:tblPr>
         <w:tblW w:type="pct" w:w="100%"/>
@@ -1925,6 +2194,42 @@
       </w:pPr>
       <w:r>
         <w:t xml:space="preserve">Annex B — Approved Sub-processors</w:t>
+      </w:r>
+    </w:p>
+    <w:p>
+      <w:pPr>
+        <w:spacing w:after="180"/>
+        <w:jc w:val="both"/>
+      </w:pPr>
+      <w:r>
+        <w:t xml:space="preserve">&lt;Voice voice="legal"&gt;Список субпроцесорів — вимога ст. 28(2) GDPR. Контролер має право заперечити проти нового субпроцесора. Без цього annex DPA не відповідає GDPR.&lt;/Voice&gt;</w:t>
+      </w:r>
+    </w:p>
+    <w:p>
+      <w:pPr>
+        <w:spacing w:after="180"/>
+        <w:jc w:val="both"/>
+      </w:pPr>
+      <w:r>
+        <w:t xml:space="preserve">&lt;Voice voice="business"&gt;Це найбільша точка тертя в DPA-переговорах. Enterprise-клієнти витрачають тижні на review кожного субпроцесора. Кожна зміна субпроцесора (навіть upgrade AWS -&gt; Azure) потребує notification process. Вартість управління цим процесом значна — закладайте її в overhead.&lt;/Voice&gt;</w:t>
+      </w:r>
+    </w:p>
+    <w:p>
+      <w:pPr>
+        <w:spacing w:after="180"/>
+        <w:jc w:val="both"/>
+      </w:pPr>
+      <w:r>
+        <w:t xml:space="preserve">&lt;Voice voice="negotiations"&gt;Клієнти хочуть "prior written consent" на кожного субпроцесора. Ринковий компроміс: notice-and-objection mechanism — ми повідомляємо за 30 днів, клієнт може заперечити, єдиний засіб захисту — termination affected services. Аргумент: "ми не можемо ставити production на паузу кожен раз, коли ви review'ите vendor." Заздалегідь складіть повний список поточних субпроцесорів — клієнти не люблять сюрпризів після підписання.&lt;/Voice&gt;</w:t>
+      </w:r>
+    </w:p>
+    <w:p>
+      <w:pPr>
+        <w:spacing w:after="180"/>
+        <w:jc w:val="both"/>
+      </w:pPr>
+      <w:r>
+        <w:t xml:space="preserve">&lt;Voice voice="delivery"&gt;Перед заповненням: проведіть аудит всіх третіх сторін, які мають доступ до даних клієнта. Це включає: cloud providers, error tracking (Sentry), analytics (Amplitude), CI/CD (GitHub Actions), communication (Slack — якщо channel містить client data). Не забудьте вказати location кожного субпроцесора.&lt;/Voice&gt;</w:t>
       </w:r>
     </w:p>
     <w:tbl>
@@ -2287,6 +2592,51 @@
       </w:pPr>
       <w:r>
         <w:t xml:space="preserve">Annex C — Technical and Organizational Measures</w:t>
+      </w:r>
+    </w:p>
+    <w:p>
+      <w:pPr>
+        <w:spacing w:after="180"/>
+        <w:jc w:val="both"/>
+      </w:pPr>
+      <w:r>
+        <w:t xml:space="preserve">&lt;Voice voice="legal"&gt;TOMs (Technical and Organizational Measures) — вимога ст. 32 GDPR. Рівень заходів має бути "appropriate to the risk." Для special categories даних — вимоги значно вищі. Цей annex може бути використаний проти вас у разі breach — описуйте те, що реально маєте, а не aspirational measures.&lt;/Voice&gt;</w:t>
+      </w:r>
+    </w:p>
+    <w:p>
+      <w:pPr>
+        <w:spacing w:after="180"/>
+        <w:jc w:val="both"/>
+      </w:pPr>
+      <w:r>
+        <w:t xml:space="preserve">&lt;Voice voice="business"&gt;Клієнти часто вимагають: SOC 2 Type II, ISO 27001, penetration testing reports. Якщо у вас немає SOC 2 — це може бути deal-breaker для enterprise. Вартість отримання SOC 2: $30-80K + 6-12 місяців. Розглядайте це як інвестицію в pipeline, а не витрату на один контракт.&lt;/Voice&gt;</w:t>
+      </w:r>
+    </w:p>
+    <w:p>
+      <w:pPr>
+        <w:spacing w:after="180"/>
+        <w:jc w:val="both"/>
+      </w:pPr>
+      <w:r>
+        <w:t xml:space="preserve">&lt;Voice voice="negotiations"&gt;Якщо у вас немає формальних сертифікацій — компенсуйте конкретикою: "AES-256 at rest, TLS 1.3 in transit, MFA for all systems, quarterly access reviews, annual pen testing." Клієнти цінують деталі більше, ніж загальні фрази. Пропонуйте щорічне оновлення Annex C як альтернативу частим аудитам.&lt;/Voice&gt;</w:t>
+      </w:r>
+    </w:p>
+    <w:p>
+      <w:pPr>
+        <w:spacing w:after="180"/>
+        <w:jc w:val="both"/>
+      </w:pPr>
+      <w:r>
+        <w:t xml:space="preserve">&lt;Voice voice="delivery"&gt;Цей annex — відповідальність CTO/Head of Security. Кожен пункт має бути реально імплементований. Після підписання — проведіть gap analysis між тим, що написано, і тим, що є. Annual review Annex C — додайте в calendar.&lt;/Voice&gt;</w:t>
+      </w:r>
+    </w:p>
+    <w:p>
+      <w:pPr>
+        <w:spacing w:after="180"/>
+        <w:jc w:val="both"/>
+      </w:pPr>
+      <w:r>
+        <w:t xml:space="preserve">&lt;Voice voice="interaction"&gt;Annex C підтримує зобов'язання з Section 2 (Processor Obligations) щодо "appropriate technical and organizational measures." Якщо клієнт проводить аудит (Section 2) — він перевірятиме саме відповідність цьому annex. Annex B (субпроцесори) — кожен субпроцесор також має відповідати рівню TOMs, описаному тут.&lt;/Voice&gt;</w:t>
       </w:r>
     </w:p>
     <w:p>

</xml_diff>